<commit_message>
Align proposal scope with frontend demo
</commit_message>
<xml_diff>
--- a/IRS-Project-Proposal-V1-CN.docx
+++ b/IRS-Project-Proposal-V1-CN.docx
@@ -771,7 +771,7 @@
         <w:pStyle w:val="1"/>
         <w:spacing w:before="360" w:after="140"/>
       </w:pPr>
-      <w:bookmarkStart w:id="0" w:name="_Toc239691255"/>
+      <w:bookmarkStart w:id="0" w:name="_Toc239790255"/>
       <w:r>
         <w:rPr>
           <w:rFonts w:eastAsia="微软雅黑"/>
@@ -817,7 +817,7 @@
           <w:r>
             <w:fldChar w:fldCharType="separate"/>
           </w:r>
-          <w:hyperlink w:anchor="_Toc239691255" w:history="1">
+          <w:hyperlink w:anchor="_Toc239790255" w:history="1">
             <w:r>
               <w:rPr>
                 <w:rStyle w:val="ad"/>
@@ -853,7 +853,7 @@
               <w:rPr>
                 <w:noProof/>
               </w:rPr>
-              <w:instrText>PAGEREF _Toc239691255 \h</w:instrText>
+              <w:instrText>PAGEREF _Toc239790255 \h</w:instrText>
             </w:r>
             <w:r>
               <w:rPr>
@@ -904,7 +904,7 @@
               <w14:ligatures w14:val="standardContextual"/>
             </w:rPr>
           </w:pPr>
-          <w:hyperlink w:anchor="_Toc239691256" w:history="1">
+          <w:hyperlink w:anchor="_Toc239790256" w:history="1">
             <w:r>
               <w:rPr>
                 <w:rStyle w:val="ad"/>
@@ -950,7 +950,7 @@
               <w:rPr>
                 <w:noProof/>
               </w:rPr>
-              <w:instrText>PAGEREF _Toc239691256 \h</w:instrText>
+              <w:instrText>PAGEREF _Toc239790256 \h</w:instrText>
             </w:r>
             <w:r>
               <w:rPr>
@@ -1001,7 +1001,7 @@
               <w14:ligatures w14:val="standardContextual"/>
             </w:rPr>
           </w:pPr>
-          <w:hyperlink w:anchor="_Toc239691257" w:history="1">
+          <w:hyperlink w:anchor="_Toc239790257" w:history="1">
             <w:r>
               <w:rPr>
                 <w:rStyle w:val="ad"/>
@@ -1047,7 +1047,7 @@
               <w:rPr>
                 <w:noProof/>
               </w:rPr>
-              <w:instrText>PAGEREF _Toc239691257 \h</w:instrText>
+              <w:instrText>PAGEREF _Toc239790257 \h</w:instrText>
             </w:r>
             <w:r>
               <w:rPr>
@@ -1098,7 +1098,7 @@
               <w14:ligatures w14:val="standardContextual"/>
             </w:rPr>
           </w:pPr>
-          <w:hyperlink w:anchor="_Toc239691258" w:history="1">
+          <w:hyperlink w:anchor="_Toc239790258" w:history="1">
             <w:r>
               <w:rPr>
                 <w:rStyle w:val="ad"/>
@@ -1144,7 +1144,7 @@
               <w:rPr>
                 <w:noProof/>
               </w:rPr>
-              <w:instrText>PAGEREF _Toc239691258 \h</w:instrText>
+              <w:instrText>PAGEREF _Toc239790258 \h</w:instrText>
             </w:r>
             <w:r>
               <w:rPr>
@@ -1195,7 +1195,7 @@
               <w14:ligatures w14:val="standardContextual"/>
             </w:rPr>
           </w:pPr>
-          <w:hyperlink w:anchor="_Toc239691259" w:history="1">
+          <w:hyperlink w:anchor="_Toc239790259" w:history="1">
             <w:r>
               <w:rPr>
                 <w:rStyle w:val="ad"/>
@@ -1241,7 +1241,7 @@
               <w:rPr>
                 <w:noProof/>
               </w:rPr>
-              <w:instrText>PAGEREF _Toc239691259 \h</w:instrText>
+              <w:instrText>PAGEREF _Toc239790259 \h</w:instrText>
             </w:r>
             <w:r>
               <w:rPr>
@@ -1292,7 +1292,7 @@
               <w14:ligatures w14:val="standardContextual"/>
             </w:rPr>
           </w:pPr>
-          <w:hyperlink w:anchor="_Toc239691260" w:history="1">
+          <w:hyperlink w:anchor="_Toc239790260" w:history="1">
             <w:r>
               <w:rPr>
                 <w:rStyle w:val="ad"/>
@@ -1408,7 +1408,7 @@
               <w:rPr>
                 <w:noProof/>
               </w:rPr>
-              <w:instrText>PAGEREF _Toc239691260 \h</w:instrText>
+              <w:instrText>PAGEREF _Toc239790260 \h</w:instrText>
             </w:r>
             <w:r>
               <w:rPr>
@@ -1459,7 +1459,7 @@
               <w14:ligatures w14:val="standardContextual"/>
             </w:rPr>
           </w:pPr>
-          <w:hyperlink w:anchor="_Toc239691261" w:history="1">
+          <w:hyperlink w:anchor="_Toc239790261" w:history="1">
             <w:r>
               <w:rPr>
                 <w:rStyle w:val="ad"/>
@@ -1505,7 +1505,7 @@
               <w:rPr>
                 <w:noProof/>
               </w:rPr>
-              <w:instrText>PAGEREF _Toc239691261 \h</w:instrText>
+              <w:instrText>PAGEREF _Toc239790261 \h</w:instrText>
             </w:r>
             <w:r>
               <w:rPr>
@@ -1556,7 +1556,7 @@
               <w14:ligatures w14:val="standardContextual"/>
             </w:rPr>
           </w:pPr>
-          <w:hyperlink w:anchor="_Toc239691262" w:history="1">
+          <w:hyperlink w:anchor="_Toc239790262" w:history="1">
             <w:r>
               <w:rPr>
                 <w:rStyle w:val="ad"/>
@@ -1592,7 +1592,7 @@
               <w:rPr>
                 <w:noProof/>
               </w:rPr>
-              <w:instrText>PAGEREF _Toc239691262 \h</w:instrText>
+              <w:instrText>PAGEREF _Toc239790262 \h</w:instrText>
             </w:r>
             <w:r>
               <w:rPr>
@@ -1643,7 +1643,7 @@
               <w14:ligatures w14:val="standardContextual"/>
             </w:rPr>
           </w:pPr>
-          <w:hyperlink w:anchor="_Toc239691263" w:history="1">
+          <w:hyperlink w:anchor="_Toc239790263" w:history="1">
             <w:r>
               <w:rPr>
                 <w:rStyle w:val="ad"/>
@@ -1689,7 +1689,7 @@
               <w:rPr>
                 <w:noProof/>
               </w:rPr>
-              <w:instrText>PAGEREF _Toc239691263 \h</w:instrText>
+              <w:instrText>PAGEREF _Toc239790263 \h</w:instrText>
             </w:r>
             <w:r>
               <w:rPr>
@@ -1740,7 +1740,7 @@
               <w14:ligatures w14:val="standardContextual"/>
             </w:rPr>
           </w:pPr>
-          <w:hyperlink w:anchor="_Toc239691264" w:history="1">
+          <w:hyperlink w:anchor="_Toc239790264" w:history="1">
             <w:r>
               <w:rPr>
                 <w:rStyle w:val="ad"/>
@@ -1786,7 +1786,7 @@
               <w:rPr>
                 <w:noProof/>
               </w:rPr>
-              <w:instrText>PAGEREF _Toc239691264 \h</w:instrText>
+              <w:instrText>PAGEREF _Toc239790264 \h</w:instrText>
             </w:r>
             <w:r>
               <w:rPr>
@@ -1837,7 +1837,7 @@
               <w14:ligatures w14:val="standardContextual"/>
             </w:rPr>
           </w:pPr>
-          <w:hyperlink w:anchor="_Toc239691265" w:history="1">
+          <w:hyperlink w:anchor="_Toc239790265" w:history="1">
             <w:r>
               <w:rPr>
                 <w:rStyle w:val="ad"/>
@@ -1883,7 +1883,7 @@
               <w:rPr>
                 <w:noProof/>
               </w:rPr>
-              <w:instrText>PAGEREF _Toc239691265 \h</w:instrText>
+              <w:instrText>PAGEREF _Toc239790265 \h</w:instrText>
             </w:r>
             <w:r>
               <w:rPr>
@@ -1934,7 +1934,7 @@
               <w14:ligatures w14:val="standardContextual"/>
             </w:rPr>
           </w:pPr>
-          <w:hyperlink w:anchor="_Toc239691266" w:history="1">
+          <w:hyperlink w:anchor="_Toc239790266" w:history="1">
             <w:r>
               <w:rPr>
                 <w:rStyle w:val="ad"/>
@@ -1980,7 +1980,7 @@
               <w:rPr>
                 <w:noProof/>
               </w:rPr>
-              <w:instrText>PAGEREF _Toc239691266 \h</w:instrText>
+              <w:instrText>PAGEREF _Toc239790266 \h</w:instrText>
             </w:r>
             <w:r>
               <w:rPr>
@@ -2031,7 +2031,7 @@
               <w14:ligatures w14:val="standardContextual"/>
             </w:rPr>
           </w:pPr>
-          <w:hyperlink w:anchor="_Toc239691267" w:history="1">
+          <w:hyperlink w:anchor="_Toc239790267" w:history="1">
             <w:r>
               <w:rPr>
                 <w:rStyle w:val="ad"/>
@@ -2077,7 +2077,7 @@
               <w:rPr>
                 <w:noProof/>
               </w:rPr>
-              <w:instrText>PAGEREF _Toc239691267 \h</w:instrText>
+              <w:instrText>PAGEREF _Toc239790267 \h</w:instrText>
             </w:r>
             <w:r>
               <w:rPr>
@@ -2128,7 +2128,7 @@
               <w14:ligatures w14:val="standardContextual"/>
             </w:rPr>
           </w:pPr>
-          <w:hyperlink w:anchor="_Toc239691268" w:history="1">
+          <w:hyperlink w:anchor="_Toc239790268" w:history="1">
             <w:r>
               <w:rPr>
                 <w:rStyle w:val="ad"/>
@@ -2174,7 +2174,7 @@
               <w:rPr>
                 <w:noProof/>
               </w:rPr>
-              <w:instrText>PAGEREF _Toc239691268 \h</w:instrText>
+              <w:instrText>PAGEREF _Toc239790268 \h</w:instrText>
             </w:r>
             <w:r>
               <w:rPr>
@@ -2225,7 +2225,7 @@
               <w14:ligatures w14:val="standardContextual"/>
             </w:rPr>
           </w:pPr>
-          <w:hyperlink w:anchor="_Toc239691269" w:history="1">
+          <w:hyperlink w:anchor="_Toc239790269" w:history="1">
             <w:r>
               <w:rPr>
                 <w:rStyle w:val="ad"/>
@@ -2271,7 +2271,7 @@
               <w:rPr>
                 <w:noProof/>
               </w:rPr>
-              <w:instrText>PAGEREF _Toc239691269 \h</w:instrText>
+              <w:instrText>PAGEREF _Toc239790269 \h</w:instrText>
             </w:r>
             <w:r>
               <w:rPr>
@@ -2322,7 +2322,7 @@
               <w14:ligatures w14:val="standardContextual"/>
             </w:rPr>
           </w:pPr>
-          <w:hyperlink w:anchor="_Toc239691270" w:history="1">
+          <w:hyperlink w:anchor="_Toc239790270" w:history="1">
             <w:r>
               <w:rPr>
                 <w:rStyle w:val="ad"/>
@@ -2368,7 +2368,7 @@
               <w:rPr>
                 <w:noProof/>
               </w:rPr>
-              <w:instrText>PAGEREF _Toc239691270 \h</w:instrText>
+              <w:instrText>PAGEREF _Toc239790270 \h</w:instrText>
             </w:r>
             <w:r>
               <w:rPr>
@@ -2419,7 +2419,7 @@
               <w14:ligatures w14:val="standardContextual"/>
             </w:rPr>
           </w:pPr>
-          <w:hyperlink w:anchor="_Toc239691271" w:history="1">
+          <w:hyperlink w:anchor="_Toc239790271" w:history="1">
             <w:r>
               <w:rPr>
                 <w:rStyle w:val="ad"/>
@@ -2465,7 +2465,7 @@
               <w:rPr>
                 <w:noProof/>
               </w:rPr>
-              <w:instrText>PAGEREF _Toc239691271 \h</w:instrText>
+              <w:instrText>PAGEREF _Toc239790271 \h</w:instrText>
             </w:r>
             <w:r>
               <w:rPr>
@@ -2516,7 +2516,7 @@
               <w14:ligatures w14:val="standardContextual"/>
             </w:rPr>
           </w:pPr>
-          <w:hyperlink w:anchor="_Toc239691272" w:history="1">
+          <w:hyperlink w:anchor="_Toc239790272" w:history="1">
             <w:r>
               <w:rPr>
                 <w:rStyle w:val="ad"/>
@@ -2562,7 +2562,7 @@
               <w:rPr>
                 <w:noProof/>
               </w:rPr>
-              <w:instrText>PAGEREF _Toc239691272 \h</w:instrText>
+              <w:instrText>PAGEREF _Toc239790272 \h</w:instrText>
             </w:r>
             <w:r>
               <w:rPr>
@@ -2613,7 +2613,7 @@
               <w14:ligatures w14:val="standardContextual"/>
             </w:rPr>
           </w:pPr>
-          <w:hyperlink w:anchor="_Toc239691273" w:history="1">
+          <w:hyperlink w:anchor="_Toc239790273" w:history="1">
             <w:r>
               <w:rPr>
                 <w:rStyle w:val="ad"/>
@@ -2659,7 +2659,7 @@
               <w:rPr>
                 <w:noProof/>
               </w:rPr>
-              <w:instrText>PAGEREF _Toc239691273 \h</w:instrText>
+              <w:instrText>PAGEREF _Toc239790273 \h</w:instrText>
             </w:r>
             <w:r>
               <w:rPr>
@@ -2710,7 +2710,7 @@
               <w14:ligatures w14:val="standardContextual"/>
             </w:rPr>
           </w:pPr>
-          <w:hyperlink w:anchor="_Toc239691274" w:history="1">
+          <w:hyperlink w:anchor="_Toc239790274" w:history="1">
             <w:r>
               <w:rPr>
                 <w:rStyle w:val="ad"/>
@@ -2756,7 +2756,7 @@
               <w:rPr>
                 <w:noProof/>
               </w:rPr>
-              <w:instrText>PAGEREF _Toc239691274 \h</w:instrText>
+              <w:instrText>PAGEREF _Toc239790274 \h</w:instrText>
             </w:r>
             <w:r>
               <w:rPr>
@@ -2807,7 +2807,7 @@
               <w14:ligatures w14:val="standardContextual"/>
             </w:rPr>
           </w:pPr>
-          <w:hyperlink w:anchor="_Toc239691275" w:history="1">
+          <w:hyperlink w:anchor="_Toc239790275" w:history="1">
             <w:r>
               <w:rPr>
                 <w:rStyle w:val="ad"/>
@@ -2853,7 +2853,7 @@
               <w:rPr>
                 <w:noProof/>
               </w:rPr>
-              <w:instrText>PAGEREF _Toc239691275 \h</w:instrText>
+              <w:instrText>PAGEREF _Toc239790275 \h</w:instrText>
             </w:r>
             <w:r>
               <w:rPr>
@@ -2904,7 +2904,7 @@
               <w14:ligatures w14:val="standardContextual"/>
             </w:rPr>
           </w:pPr>
-          <w:hyperlink w:anchor="_Toc239691276" w:history="1">
+          <w:hyperlink w:anchor="_Toc239790276" w:history="1">
             <w:r>
               <w:rPr>
                 <w:rStyle w:val="ad"/>
@@ -2950,7 +2950,7 @@
               <w:rPr>
                 <w:noProof/>
               </w:rPr>
-              <w:instrText>PAGEREF _Toc239691276 \h</w:instrText>
+              <w:instrText>PAGEREF _Toc239790276 \h</w:instrText>
             </w:r>
             <w:r>
               <w:rPr>
@@ -3001,7 +3001,7 @@
               <w14:ligatures w14:val="standardContextual"/>
             </w:rPr>
           </w:pPr>
-          <w:hyperlink w:anchor="_Toc239691277" w:history="1">
+          <w:hyperlink w:anchor="_Toc239790277" w:history="1">
             <w:r>
               <w:rPr>
                 <w:rStyle w:val="ad"/>
@@ -3047,7 +3047,7 @@
               <w:rPr>
                 <w:noProof/>
               </w:rPr>
-              <w:instrText>PAGEREF _Toc239691277 \h</w:instrText>
+              <w:instrText>PAGEREF _Toc239790277 \h</w:instrText>
             </w:r>
             <w:r>
               <w:rPr>
@@ -3098,7 +3098,7 @@
               <w14:ligatures w14:val="standardContextual"/>
             </w:rPr>
           </w:pPr>
-          <w:hyperlink w:anchor="_Toc239691278" w:history="1">
+          <w:hyperlink w:anchor="_Toc239790278" w:history="1">
             <w:r>
               <w:rPr>
                 <w:rStyle w:val="ad"/>
@@ -3144,7 +3144,7 @@
               <w:rPr>
                 <w:noProof/>
               </w:rPr>
-              <w:instrText>PAGEREF _Toc239691278 \h</w:instrText>
+              <w:instrText>PAGEREF _Toc239790278 \h</w:instrText>
             </w:r>
             <w:r>
               <w:rPr>
@@ -3197,7 +3197,7 @@
         <w:pStyle w:val="1"/>
         <w:spacing w:before="360" w:after="140"/>
       </w:pPr>
-      <w:bookmarkStart w:id="1" w:name="_Toc239691256"/>
+      <w:bookmarkStart w:id="1" w:name="_Toc239790256"/>
       <w:r>
         <w:rPr>
           <w:rFonts w:eastAsia="微软雅黑"/>
@@ -3228,7 +3228,7 @@
         <w:pStyle w:val="2"/>
         <w:spacing w:before="240" w:after="140"/>
       </w:pPr>
-      <w:bookmarkStart w:id="2" w:name="_Toc239691257"/>
+      <w:bookmarkStart w:id="2" w:name="_Toc239790257"/>
       <w:r>
         <w:rPr>
           <w:rFonts w:eastAsia="微软雅黑"/>
@@ -3291,7 +3291,7 @@
         <w:rPr>
           <w:rFonts w:eastAsia="微软雅黑"/>
         </w:rPr>
-        <w:t>分析、简历优化和模拟面试支持。学生上传简历并填写求职意向后，系统会解析学生技能、项目经历和偏好，从公开岗位信息中推荐合适机会，说明推荐原因，并根据目标岗位生成后续准备建议。</w:t>
+        <w:t>分析、简历优化和模拟面试支持。学生上传简历并填写求职意向后，系统会解析学生技能、项目经历和偏好，从公开岗位信息中推荐合适机会，说明推荐原因，并根据目标岗位生成简历改写建议、模拟面试题库和后续准备建议。</w:t>
       </w:r>
     </w:p>
     <w:p>
@@ -3302,7 +3302,7 @@
         <w:rPr>
           <w:rFonts w:eastAsia="微软雅黑"/>
         </w:rPr>
-        <w:t>本项目的核心价值不是简单地增加投递数量，而是帮助学生把有限时间投入到更值得申请的岗位上。系统通过规则筛选排除明显不适合的岗位，通过语义匹配和技能知识库解释匹配度与技能差距，再用受事实约束的生成模块改写简历要点并准备模拟面试问题。因此，学生能够更清楚地知道为什么申请某个岗位、应该如何修改材料，以及面试前需要重点准备什么。</w:t>
+        <w:t>本项目的核心价值不是简单地增加投递数量，而是帮助学生把有限时间投入到更值得申请的岗位上。系统通过规则筛选排除明显不适合的岗位，通过语义匹配和技能知识库解释匹配度与技能差距，再用受事实约束的生成模块改写简历要点，并生成模拟面试题库、作答记录和反馈建议。因此，学生能够更清楚地知道为什么申请某个岗位、应该如何修改材料，以及面试前需要重点准备什么。</w:t>
       </w:r>
     </w:p>
     <w:p>
@@ -3310,7 +3310,7 @@
         <w:pStyle w:val="2"/>
         <w:spacing w:before="240" w:after="140"/>
       </w:pPr>
-      <w:bookmarkStart w:id="3" w:name="_Toc239691258"/>
+      <w:bookmarkStart w:id="3" w:name="_Toc239790258"/>
       <w:r>
         <w:rPr>
           <w:rFonts w:eastAsia="微软雅黑"/>
@@ -3531,7 +3531,7 @@
                 <w:sz w:val="19"/>
                 <w:szCs w:val="19"/>
               </w:rPr>
-              <w:t>根据目标岗位生成模拟面试问题和准备建议，帮助学生完成从申请材料到面试准备的闭环。</w:t>
+              <w:t>根据目标岗位生成模拟面试题库、作答记录和反馈建议，帮助学生完成从申请材料到面试准备的闭环。</w:t>
             </w:r>
           </w:p>
         </w:tc>
@@ -3547,7 +3547,7 @@
         <w:pStyle w:val="1"/>
         <w:spacing w:before="360" w:after="140"/>
       </w:pPr>
-      <w:bookmarkStart w:id="4" w:name="_Toc239691259"/>
+      <w:bookmarkStart w:id="4" w:name="_Toc239790259"/>
       <w:r>
         <w:rPr>
           <w:rFonts w:eastAsia="微软雅黑"/>
@@ -3578,7 +3578,7 @@
         <w:pStyle w:val="2"/>
         <w:spacing w:before="240" w:after="140"/>
       </w:pPr>
-      <w:bookmarkStart w:id="5" w:name="_Toc239691260"/>
+      <w:bookmarkStart w:id="5" w:name="_Toc239790260"/>
       <w:r>
         <w:rPr>
           <w:rFonts w:eastAsia="微软雅黑"/>
@@ -3685,7 +3685,7 @@
         <w:pStyle w:val="2"/>
         <w:spacing w:before="240" w:after="140"/>
       </w:pPr>
-      <w:bookmarkStart w:id="6" w:name="_Toc239691261"/>
+      <w:bookmarkStart w:id="6" w:name="_Toc239790261"/>
       <w:r>
         <w:rPr>
           <w:rFonts w:eastAsia="微软雅黑"/>
@@ -3715,7 +3715,7 @@
         <w:pStyle w:val="2"/>
         <w:spacing w:before="240" w:after="140"/>
       </w:pPr>
-      <w:bookmarkStart w:id="7" w:name="_Toc239691262"/>
+      <w:bookmarkStart w:id="7" w:name="_Toc239790262"/>
       <w:r>
         <w:rPr>
           <w:rFonts w:eastAsia="微软雅黑"/>
@@ -3932,7 +3932,7 @@
         <w:rPr>
           <w:rFonts w:eastAsia="微软雅黑"/>
         </w:rPr>
-        <w:t>系统根据目标岗位的技能和职责，生成模拟面试问题与准备建议，帮助学生在修改简历后继续准备面试。</w:t>
+        <w:t>系统根据目标岗位的技能、职责和简历差距，生成模拟面试题库，并在前端提供录制作答、转写占位和逐题反馈原型，帮助学生在修改简历后继续准备面试。</w:t>
       </w:r>
     </w:p>
     <w:p>
@@ -3976,7 +3976,7 @@
         <w:rPr>
           <w:rFonts w:eastAsia="微软雅黑"/>
         </w:rPr>
-        <w:t>优化器生成每周申请计划：在尊重截止日期和声明时间预算的前提下，确定准备哪些目标以及按什么顺序准备。</w:t>
+        <w:t>系统在目标岗位页展示准备进度和基础申请计划建议：在参考截止日期和声明时间预算的前提下，提示先准备哪些目标以及下一步行动。</w:t>
       </w:r>
     </w:p>
     <w:p>
@@ -3989,7 +3989,7 @@
         <w:pStyle w:val="1"/>
         <w:spacing w:before="360" w:after="140"/>
       </w:pPr>
-      <w:bookmarkStart w:id="8" w:name="_Toc239691263"/>
+      <w:bookmarkStart w:id="8" w:name="_Toc239790263"/>
       <w:r>
         <w:rPr>
           <w:rFonts w:eastAsia="微软雅黑"/>
@@ -4020,7 +4020,7 @@
         <w:pStyle w:val="2"/>
         <w:spacing w:before="240" w:after="140"/>
       </w:pPr>
-      <w:bookmarkStart w:id="9" w:name="_Toc239691264"/>
+      <w:bookmarkStart w:id="9" w:name="_Toc239790264"/>
       <w:r>
         <w:rPr>
           <w:rFonts w:eastAsia="微软雅黑"/>
@@ -5939,7 +5939,7 @@
         <w:pStyle w:val="2"/>
         <w:spacing w:before="240" w:after="140"/>
       </w:pPr>
-      <w:bookmarkStart w:id="10" w:name="_Toc239691265"/>
+      <w:bookmarkStart w:id="10" w:name="_Toc239790265"/>
       <w:r>
         <w:rPr>
           <w:rFonts w:eastAsia="微软雅黑"/>
@@ -6004,7 +6004,7 @@
         <w:pStyle w:val="2"/>
         <w:spacing w:before="240" w:after="140"/>
       </w:pPr>
-      <w:bookmarkStart w:id="11" w:name="_Toc239691266"/>
+      <w:bookmarkStart w:id="11" w:name="_Toc239790266"/>
       <w:r>
         <w:rPr>
           <w:rFonts w:eastAsia="微软雅黑"/>
@@ -6077,7 +6077,7 @@
           <w:szCs w:val="22"/>
         </w:rPr>
       </w:pPr>
-      <w:bookmarkStart w:id="12" w:name="_Toc239691267"/>
+      <w:bookmarkStart w:id="12" w:name="_Toc239790267"/>
       <w:r>
         <w:rPr>
           <w:rFonts w:eastAsia="微软雅黑"/>
@@ -6228,7 +6228,7 @@
         <w:pStyle w:val="1"/>
         <w:spacing w:before="360" w:after="140"/>
       </w:pPr>
-      <w:bookmarkStart w:id="13" w:name="_Toc239691268"/>
+      <w:bookmarkStart w:id="13" w:name="_Toc239790268"/>
       <w:r>
         <w:rPr>
           <w:rFonts w:eastAsia="微软雅黑"/>
@@ -6259,7 +6259,7 @@
         <w:pStyle w:val="2"/>
         <w:spacing w:before="240" w:after="140"/>
       </w:pPr>
-      <w:bookmarkStart w:id="14" w:name="_Toc239691269"/>
+      <w:bookmarkStart w:id="14" w:name="_Toc239790269"/>
       <w:r>
         <w:rPr>
           <w:rFonts w:eastAsia="微软雅黑"/>
@@ -6352,7 +6352,7 @@
         <w:rPr>
           <w:rFonts w:eastAsia="微软雅黑"/>
         </w:rPr>
-        <w:t>分析、简历优化、技能差距解释、模拟面试和基础申请计划。</w:t>
+        <w:t>分析、简历优化、技能差距解释、视频模拟面试原型、目标岗位进度跟踪和基础申请计划建议。</w:t>
       </w:r>
     </w:p>
     <w:p>
@@ -7215,7 +7215,7 @@
                 <w:sz w:val="19"/>
                 <w:szCs w:val="19"/>
               </w:rPr>
-              <w:t>根据岗位技能、职责和简历内容生成模拟面试问题</w:t>
+              <w:t>根据岗位技能、职责和简历内容生成模拟面试题库，并提供录制作答、转写和点评的前端原型</w:t>
             </w:r>
           </w:p>
         </w:tc>
@@ -7239,7 +7239,7 @@
                 <w:sz w:val="19"/>
                 <w:szCs w:val="19"/>
               </w:rPr>
-              <w:t>帮助学生准备技术问题和行为问题</w:t>
+              <w:t>帮助学生准备技术问题、行为问题和面试表达</w:t>
             </w:r>
           </w:p>
         </w:tc>
@@ -7266,7 +7266,7 @@
                 <w:sz w:val="19"/>
                 <w:szCs w:val="19"/>
               </w:rPr>
-              <w:t>申请计划</w:t>
+              <w:t>申请进度与计划建议</w:t>
             </w:r>
           </w:p>
         </w:tc>
@@ -7291,7 +7291,7 @@
                 <w:sz w:val="19"/>
                 <w:szCs w:val="19"/>
               </w:rPr>
-              <w:t>根据时间预算和截止日期安排申请优先级</w:t>
+              <w:t>根据目标岗位状态、截止日期和时间预算提示下一步行动</w:t>
             </w:r>
           </w:p>
         </w:tc>
@@ -7316,7 +7316,23 @@
                 <w:sz w:val="19"/>
                 <w:szCs w:val="19"/>
               </w:rPr>
-              <w:t>作为优化推理示例</w:t>
+              <w:t>与当前</w:t>
+            </w:r>
+            <w:r>
+              <w:rPr>
+                <w:rFonts w:eastAsia="微软雅黑"/>
+                <w:sz w:val="19"/>
+                <w:szCs w:val="19"/>
+              </w:rPr>
+              <w:t xml:space="preserve"> demo </w:t>
+            </w:r>
+            <w:r>
+              <w:rPr>
+                <w:rFonts w:eastAsia="微软雅黑"/>
+                <w:sz w:val="19"/>
+                <w:szCs w:val="19"/>
+              </w:rPr>
+              <w:t>的目标岗位进度跟踪保持一致，可在后续扩展为优化算法</w:t>
             </w:r>
           </w:p>
         </w:tc>
@@ -7486,7 +7502,7 @@
         <w:pStyle w:val="2"/>
         <w:spacing w:before="240" w:after="140"/>
       </w:pPr>
-      <w:bookmarkStart w:id="15" w:name="_Toc239691270"/>
+      <w:bookmarkStart w:id="15" w:name="_Toc239790270"/>
       <w:r>
         <w:rPr>
           <w:rFonts w:eastAsia="微软雅黑"/>
@@ -7647,23 +7663,16 @@
                 <w:sz w:val="19"/>
                 <w:szCs w:val="19"/>
               </w:rPr>
-              <w:t>被主要平台服务条款禁止（第</w:t>
-            </w:r>
-            <w:r>
-              <w:rPr>
-                <w:rFonts w:eastAsia="微软雅黑"/>
-                <w:sz w:val="19"/>
-                <w:szCs w:val="19"/>
-              </w:rPr>
-              <w:t xml:space="preserve"> 4.2.2 </w:t>
-            </w:r>
-            <w:r>
-              <w:rPr>
-                <w:rFonts w:eastAsia="微软雅黑"/>
-                <w:sz w:val="19"/>
-                <w:szCs w:val="19"/>
-              </w:rPr>
-              <w:t>节），且不可逆行动不应在缺乏人工审阅时委托给自动化。系统生成完整申请包，由学生自行提交。这保留了全部实质收益，同时保持合规。</w:t>
+              <w:t>主要招聘平台通常限制自动化提交，且不可逆行动不应在缺乏人工审阅时委托给自动化。系统生成申请材料和岗位链接，由学生自行提交。这保留了主要实</w:t>
+            </w:r>
+            <w:r>
+              <w:rPr>
+                <w:rFonts w:eastAsia="微软雅黑"/>
+                <w:sz w:val="19"/>
+                <w:szCs w:val="19"/>
+              </w:rPr>
+              <w:lastRenderedPageBreak/>
+              <w:t>质收益，同时保持合规。</w:t>
             </w:r>
           </w:p>
         </w:tc>
@@ -7690,6 +7699,7 @@
                 <w:sz w:val="19"/>
                 <w:szCs w:val="19"/>
               </w:rPr>
+              <w:lastRenderedPageBreak/>
               <w:t>保证面试或</w:t>
             </w:r>
             <w:r>
@@ -7749,7 +7759,6 @@
                 <w:sz w:val="19"/>
                 <w:szCs w:val="19"/>
               </w:rPr>
-              <w:lastRenderedPageBreak/>
               <w:t>生成学生并不具备的经历</w:t>
             </w:r>
           </w:p>
@@ -7774,23 +7783,7 @@
                 <w:sz w:val="19"/>
                 <w:szCs w:val="19"/>
               </w:rPr>
-              <w:t>这是由事实一致性检查器强制执行并在目标</w:t>
-            </w:r>
-            <w:r>
-              <w:rPr>
-                <w:rFonts w:eastAsia="微软雅黑"/>
-                <w:sz w:val="19"/>
-                <w:szCs w:val="19"/>
-              </w:rPr>
-              <w:t xml:space="preserve"> G3 </w:t>
-            </w:r>
-            <w:r>
-              <w:rPr>
-                <w:rFonts w:eastAsia="微软雅黑"/>
-                <w:sz w:val="19"/>
-                <w:szCs w:val="19"/>
-              </w:rPr>
-              <w:t>下度量的硬设计约束。系统改进真实经历的表达方式；它不编造。</w:t>
+              <w:t>这是系统事实一致性检查器需要强制执行的硬设计约束。系统改进真实经历的表达方式；它不编造。</w:t>
             </w:r>
           </w:p>
         </w:tc>
@@ -7976,23 +7969,7 @@
                 <w:sz w:val="19"/>
                 <w:szCs w:val="19"/>
               </w:rPr>
-              <w:t>项目开始时没有结果标签。通过第</w:t>
-            </w:r>
-            <w:r>
-              <w:rPr>
-                <w:rFonts w:eastAsia="微软雅黑"/>
-                <w:sz w:val="19"/>
-                <w:szCs w:val="19"/>
-              </w:rPr>
-              <w:t xml:space="preserve"> 7.6 </w:t>
-            </w:r>
-            <w:r>
-              <w:rPr>
-                <w:rFonts w:eastAsia="微软雅黑"/>
-                <w:sz w:val="19"/>
-                <w:szCs w:val="19"/>
-              </w:rPr>
-              <w:t>节描述的代理标注策略处理。</w:t>
+              <w:t>项目开始时没有结果标签。本阶段通过团队人工标注和样例测试做初步评估，真实申请结果学习作为未来工作。</w:t>
             </w:r>
           </w:p>
         </w:tc>
@@ -8042,23 +8019,7 @@
                 <w:sz w:val="19"/>
                 <w:szCs w:val="19"/>
               </w:rPr>
-              <w:t>第</w:t>
-            </w:r>
-            <w:r>
-              <w:rPr>
-                <w:rFonts w:eastAsia="微软雅黑"/>
-                <w:sz w:val="19"/>
-                <w:szCs w:val="19"/>
-              </w:rPr>
-              <w:t xml:space="preserve"> 4.2.2 </w:t>
-            </w:r>
-            <w:r>
-              <w:rPr>
-                <w:rFonts w:eastAsia="微软雅黑"/>
-                <w:sz w:val="19"/>
-                <w:szCs w:val="19"/>
-              </w:rPr>
-              <w:t>节引用的条款禁止此行为。获取依赖开放数据集，以及对公司招聘页面进行小规模、限速、遵守</w:t>
+              <w:t>主要平台条款通常限制此类行为。获取依赖开放数据集，以及对公司招聘页面进行小规模、限速、遵守</w:t>
             </w:r>
             <w:r>
               <w:rPr>
@@ -8085,7 +8046,7 @@
         <w:pStyle w:val="2"/>
         <w:spacing w:before="240" w:after="140"/>
       </w:pPr>
-      <w:bookmarkStart w:id="16" w:name="_Toc239691271"/>
+      <w:bookmarkStart w:id="16" w:name="_Toc239790271"/>
       <w:r>
         <w:rPr>
           <w:rFonts w:eastAsia="微软雅黑"/>
@@ -8147,7 +8108,7 @@
         <w:rPr>
           <w:rFonts w:eastAsia="微软雅黑"/>
         </w:rPr>
-        <w:t>的简历优化和模拟面试。</w:t>
+        <w:t>的简历优化、视频模拟面试原型和目标岗位进度跟踪。</w:t>
       </w:r>
     </w:p>
     <w:p>
@@ -8248,7 +8209,7 @@
         <w:pStyle w:val="1"/>
         <w:spacing w:before="360" w:after="140"/>
       </w:pPr>
-      <w:bookmarkStart w:id="17" w:name="_Toc239691272"/>
+      <w:bookmarkStart w:id="17" w:name="_Toc239790272"/>
       <w:r>
         <w:rPr>
           <w:rFonts w:eastAsia="微软雅黑"/>
@@ -8814,7 +8775,7 @@
                 <w:sz w:val="19"/>
                 <w:szCs w:val="19"/>
               </w:rPr>
-              <w:t>模拟面试问题生成和面试准备建议</w:t>
+              <w:t>模拟面试题库、作答反馈和点评规则设计</w:t>
             </w:r>
           </w:p>
         </w:tc>
@@ -8932,7 +8893,7 @@
         <w:pStyle w:val="1"/>
         <w:spacing w:before="360" w:after="140"/>
       </w:pPr>
-      <w:bookmarkStart w:id="18" w:name="_Toc239691273"/>
+      <w:bookmarkStart w:id="18" w:name="_Toc239790273"/>
       <w:r>
         <w:rPr>
           <w:rFonts w:eastAsia="微软雅黑"/>
@@ -8963,7 +8924,7 @@
         <w:pStyle w:val="2"/>
         <w:spacing w:before="240" w:after="140"/>
       </w:pPr>
-      <w:bookmarkStart w:id="19" w:name="_Toc239691274"/>
+      <w:bookmarkStart w:id="19" w:name="_Toc239790274"/>
       <w:r>
         <w:rPr>
           <w:rFonts w:eastAsia="微软雅黑"/>
@@ -9032,7 +8993,7 @@
         <w:rPr>
           <w:rFonts w:eastAsia="微软雅黑"/>
         </w:rPr>
-        <w:t>给出简历优化建议和模拟面试问题；界面层向学生展示推荐岗位、匹配原因、简历修改建议和面试准备内容。</w:t>
+        <w:t>给出简历优化建议、模拟面试题库和反馈建议；界面层向学生展示推荐岗位、匹配原因、简历修改建议、面试准备内容和目标岗位进度。</w:t>
       </w:r>
     </w:p>
     <w:p>
@@ -9161,7 +9122,7 @@
         <w:pStyle w:val="2"/>
         <w:spacing w:before="240" w:after="140"/>
       </w:pPr>
-      <w:bookmarkStart w:id="20" w:name="_Toc239691275"/>
+      <w:bookmarkStart w:id="20" w:name="_Toc239790275"/>
       <w:r>
         <w:rPr>
           <w:rFonts w:eastAsia="微软雅黑"/>
@@ -9233,7 +9194,14 @@
         <w:rPr>
           <w:rFonts w:eastAsia="微软雅黑"/>
         </w:rPr>
-        <w:t>规则推理用于处理工作准证、学历、地点、截止日期等硬约束，因为这些条件不能简单地与相似度分数相互抵消。</w:t>
+        <w:t>规则推理用于处理工作准证、学历、地点、截止日期等硬约束，因为这些条件不能简单地与相似度分数相</w:t>
+      </w:r>
+      <w:r>
+        <w:rPr>
+          <w:rFonts w:eastAsia="微软雅黑"/>
+        </w:rPr>
+        <w:lastRenderedPageBreak/>
+        <w:t>互抵消。</w:t>
       </w:r>
     </w:p>
     <w:p>
@@ -9249,7 +9217,6 @@
           <w:sz w:val="19"/>
           <w:szCs w:val="19"/>
         </w:rPr>
-        <w:lastRenderedPageBreak/>
         <w:t>语义匹配和统计排序用于比较简历项目</w:t>
       </w:r>
       <w:r>
@@ -9351,7 +9318,7 @@
           <w:sz w:val="22"/>
           <w:szCs w:val="22"/>
         </w:rPr>
-        <w:t>改写和模拟面试问题生成，但输出需要受事实约束，避免虚构学生经历。</w:t>
+        <w:t>改写、模拟面试题库生成和反馈建议生成，但输出需要受事实约束，避免虚构学生经历。</w:t>
       </w:r>
     </w:p>
     <w:p>
@@ -9362,7 +9329,7 @@
         <w:rPr>
           <w:rFonts w:eastAsia="微软雅黑"/>
         </w:rPr>
-        <w:t>优化算法用于在有限每周时间预算、岗位截止日期和准备成本之间安排申请优先级。</w:t>
+        <w:t>基础计划逻辑用于结合目标岗位状态、岗位截止日期和每周时间预算，生成可解释的下一步准备建议。</w:t>
       </w:r>
     </w:p>
     <w:p>
@@ -9370,7 +9337,7 @@
         <w:pStyle w:val="2"/>
         <w:spacing w:before="240" w:after="140"/>
       </w:pPr>
-      <w:bookmarkStart w:id="21" w:name="_Toc239691276"/>
+      <w:bookmarkStart w:id="21" w:name="_Toc239790276"/>
       <w:r>
         <w:rPr>
           <w:rFonts w:eastAsia="微软雅黑"/>
@@ -9599,7 +9566,7 @@
                 <w:sz w:val="18"/>
                 <w:szCs w:val="18"/>
               </w:rPr>
-              <w:t>界面</w:t>
+              <w:t>前端界面</w:t>
             </w:r>
           </w:p>
         </w:tc>
@@ -9624,7 +9591,7 @@
                 <w:sz w:val="18"/>
                 <w:szCs w:val="18"/>
               </w:rPr>
-              <w:t>Streamlit</w:t>
+              <w:t>React / TypeScript / 单文件 HTML 原型</w:t>
             </w:r>
           </w:p>
         </w:tc>
@@ -9649,7 +9616,7 @@
                 <w:sz w:val="18"/>
                 <w:szCs w:val="18"/>
               </w:rPr>
-              <w:t>在工作量预算内提供可演示界面；</w:t>
+              <w:t>与当前</w:t>
             </w:r>
             <w:r>
               <w:rPr>
@@ -9657,7 +9624,7 @@
                 <w:sz w:val="18"/>
                 <w:szCs w:val="18"/>
               </w:rPr>
-              <w:t xml:space="preserve">React </w:t>
+              <w:t xml:space="preserve"> demo </w:t>
             </w:r>
             <w:r>
               <w:rPr>
@@ -9665,7 +9632,23 @@
                 <w:sz w:val="18"/>
                 <w:szCs w:val="18"/>
               </w:rPr>
-              <w:t>前端会消耗本应投入推理组件的时间</w:t>
+              <w:t>保持一致，支持多页面交互、岗位推荐、简历改写审阅、视频模拟面试和目标岗位进度展示；后续通过</w:t>
+            </w:r>
+            <w:r>
+              <w:rPr>
+                <w:rFonts w:eastAsia="微软雅黑"/>
+                <w:sz w:val="18"/>
+                <w:szCs w:val="18"/>
+              </w:rPr>
+              <w:t xml:space="preserve"> FastAPI </w:t>
+            </w:r>
+            <w:r>
+              <w:rPr>
+                <w:rFonts w:eastAsia="微软雅黑"/>
+                <w:sz w:val="18"/>
+                <w:szCs w:val="18"/>
+              </w:rPr>
+              <w:t>接入真实推理模块</w:t>
             </w:r>
           </w:p>
         </w:tc>
@@ -10288,7 +10271,7 @@
                 <w:sz w:val="18"/>
                 <w:szCs w:val="18"/>
               </w:rPr>
-              <w:t>优化</w:t>
+              <w:t>申请计划逻辑</w:t>
             </w:r>
           </w:p>
         </w:tc>
@@ -10312,7 +10295,7 @@
                 <w:sz w:val="18"/>
                 <w:szCs w:val="18"/>
               </w:rPr>
-              <w:t>DEAP</w:t>
+              <w:t>启发式排序 / 规则优先级</w:t>
             </w:r>
           </w:p>
         </w:tc>
@@ -10336,7 +10319,7 @@
                 <w:sz w:val="18"/>
                 <w:szCs w:val="18"/>
               </w:rPr>
-              <w:t>透明的</w:t>
+              <w:t>当前</w:t>
             </w:r>
             <w:r>
               <w:rPr>
@@ -10344,7 +10327,7 @@
                 <w:sz w:val="18"/>
                 <w:szCs w:val="18"/>
               </w:rPr>
-              <w:t xml:space="preserve"> GA </w:t>
+              <w:t xml:space="preserve"> demo </w:t>
             </w:r>
             <w:r>
               <w:rPr>
@@ -10352,7 +10335,7 @@
                 <w:sz w:val="18"/>
                 <w:szCs w:val="18"/>
               </w:rPr>
-              <w:t>数据结构，适合快速原型化算子</w:t>
+              <w:t>使用可解释规则安排下一步行动；遗传算法可作为后续扩展，不作为核心交付依赖</w:t>
             </w:r>
           </w:p>
         </w:tc>
@@ -10541,7 +10524,19 @@
         <w:rPr>
           <w:rFonts w:eastAsia="微软雅黑"/>
         </w:rPr>
-        <w:t>技术栈表保留如下，作为后续实现阶段的初步选型。</w:t>
+        <w:t>技术栈表保留如下，作为后续实现阶段的初步选型，并与当前前端</w:t>
+      </w:r>
+      <w:r>
+        <w:rPr>
+          <w:rFonts w:eastAsia="微软雅黑"/>
+        </w:rPr>
+        <w:t xml:space="preserve"> demo </w:t>
+      </w:r>
+      <w:r>
+        <w:rPr>
+          <w:rFonts w:eastAsia="微软雅黑"/>
+        </w:rPr>
+        <w:t>保持一致。</w:t>
       </w:r>
     </w:p>
     <w:p>
@@ -10554,7 +10549,7 @@
         <w:pStyle w:val="1"/>
         <w:spacing w:before="360" w:after="140"/>
       </w:pPr>
-      <w:bookmarkStart w:id="22" w:name="_Toc239691277"/>
+      <w:bookmarkStart w:id="22" w:name="_Toc239790277"/>
       <w:r>
         <w:rPr>
           <w:rFonts w:eastAsia="微软雅黑"/>
@@ -11331,23 +11326,23 @@
                 <w:sz w:val="19"/>
                 <w:szCs w:val="19"/>
               </w:rPr>
-              <w:t>遗传优化器；代理编排；</w:t>
-            </w:r>
-            <w:r>
-              <w:rPr>
-                <w:rFonts w:eastAsia="微软雅黑"/>
-                <w:sz w:val="19"/>
-                <w:szCs w:val="19"/>
-              </w:rPr>
-              <w:t xml:space="preserve">Streamlit </w:t>
-            </w:r>
-            <w:r>
-              <w:rPr>
-                <w:rFonts w:eastAsia="微软雅黑"/>
-                <w:sz w:val="19"/>
-                <w:szCs w:val="19"/>
-              </w:rPr>
-              <w:t>界面；可演示系统</w:t>
+              <w:t>目标岗位进度跟踪；前端界面；后端</w:t>
+            </w:r>
+            <w:r>
+              <w:rPr>
+                <w:rFonts w:eastAsia="微软雅黑"/>
+                <w:sz w:val="19"/>
+                <w:szCs w:val="19"/>
+              </w:rPr>
+              <w:t xml:space="preserve"> API </w:t>
+            </w:r>
+            <w:r>
+              <w:rPr>
+                <w:rFonts w:eastAsia="微软雅黑"/>
+                <w:sz w:val="19"/>
+                <w:szCs w:val="19"/>
+              </w:rPr>
+              <w:t>编排；可演示系统</w:t>
             </w:r>
           </w:p>
         </w:tc>
@@ -11573,7 +11568,7 @@
         <w:pStyle w:val="1"/>
         <w:spacing w:before="360" w:after="140"/>
       </w:pPr>
-      <w:bookmarkStart w:id="23" w:name="_Toc239691278"/>
+      <w:bookmarkStart w:id="23" w:name="_Toc239790278"/>
       <w:r>
         <w:rPr>
           <w:rFonts w:eastAsia="微软雅黑"/>
@@ -12240,40 +12235,41 @@
                 <w:sz w:val="18"/>
                 <w:szCs w:val="18"/>
               </w:rPr>
-              <w:t xml:space="preserve">DEAP </w:t>
-            </w:r>
+              <w:t>基础申请计划规则</w:t>
+            </w:r>
+          </w:p>
+        </w:tc>
+        <w:tc>
+          <w:tcPr>
+            <w:tcW w:w="1900" w:type="dxa"/>
+            <w:shd w:val="clear" w:color="auto" w:fill="F2F2F2"/>
+            <w:tcMar>
+              <w:top w:w="60" w:type="dxa"/>
+              <w:left w:w="90" w:type="dxa"/>
+              <w:bottom w:w="60" w:type="dxa"/>
+              <w:right w:w="90" w:type="dxa"/>
+            </w:tcMar>
+          </w:tcPr>
+          <w:p>
+            <w:pPr>
+              <w:spacing w:after="40"/>
+            </w:pPr>
             <w:r>
               <w:rPr>
                 <w:rFonts w:eastAsia="微软雅黑"/>
                 <w:sz w:val="18"/>
                 <w:szCs w:val="18"/>
               </w:rPr>
-              <w:t>遗传算法优化器</w:t>
-            </w:r>
-          </w:p>
-        </w:tc>
-        <w:tc>
-          <w:tcPr>
-            <w:tcW w:w="1900" w:type="dxa"/>
-            <w:shd w:val="clear" w:color="auto" w:fill="F2F2F2"/>
-            <w:tcMar>
-              <w:top w:w="60" w:type="dxa"/>
-              <w:left w:w="90" w:type="dxa"/>
-              <w:bottom w:w="60" w:type="dxa"/>
-              <w:right w:w="90" w:type="dxa"/>
-            </w:tcMar>
-          </w:tcPr>
-          <w:p>
-            <w:pPr>
-              <w:spacing w:after="40"/>
-            </w:pPr>
+              <w:t>将目标岗位进度、截止日期和时间预算形成下一步行动建议，并由团</w:t>
+            </w:r>
             <w:r>
               <w:rPr>
                 <w:rFonts w:eastAsia="微软雅黑"/>
                 <w:sz w:val="18"/>
                 <w:szCs w:val="18"/>
               </w:rPr>
-              <w:t>将优化器生成的申请计划与简单按分数排序的计划比较，检查其是否</w:t>
+              <w:lastRenderedPageBreak/>
+              <w:t>队检查建议是否符合</w:t>
             </w:r>
             <w:r>
               <w:rPr>
@@ -12281,8 +12277,15 @@
                 <w:sz w:val="18"/>
                 <w:szCs w:val="18"/>
               </w:rPr>
-              <w:lastRenderedPageBreak/>
-              <w:t>合理考虑时间预算、准备成本和截止日期。</w:t>
+              <w:t xml:space="preserve"> demo </w:t>
+            </w:r>
+            <w:r>
+              <w:rPr>
+                <w:rFonts w:eastAsia="微软雅黑"/>
+                <w:sz w:val="18"/>
+                <w:szCs w:val="18"/>
+              </w:rPr>
+              <w:t>流程。</w:t>
             </w:r>
           </w:p>
         </w:tc>
@@ -12308,7 +12311,7 @@
                 <w:szCs w:val="18"/>
               </w:rPr>
               <w:lastRenderedPageBreak/>
-              <w:t>评估申请计划模块的可用性。</w:t>
+              <w:t>评估申请计划与目标岗位跟踪模块的可用性。</w:t>
             </w:r>
           </w:p>
         </w:tc>
@@ -12334,7 +12337,7 @@
                 <w:sz w:val="18"/>
                 <w:szCs w:val="18"/>
               </w:rPr>
-              <w:t>模拟面试生成模块</w:t>
+              <w:t>视频模拟面试原型</w:t>
             </w:r>
           </w:p>
         </w:tc>
@@ -12374,7 +12377,7 @@
                 <w:sz w:val="18"/>
                 <w:szCs w:val="18"/>
               </w:rPr>
-              <w:t>、岗位技能和简历内容生成问题，由团队检查问题是否贴合岗位且不偏离学生背景。</w:t>
+              <w:t>、岗位技能和简历内容生成题库、作答记录和反馈建议，由团队检查内容是否贴合岗位且不偏离学生背景。</w:t>
             </w:r>
           </w:p>
         </w:tc>
@@ -12398,7 +12401,7 @@
                 <w:sz w:val="18"/>
                 <w:szCs w:val="18"/>
               </w:rPr>
-              <w:t>评估面试准备内容是否实用。</w:t>
+              <w:t>评估面试准备与反馈内容是否实用。</w:t>
             </w:r>
           </w:p>
         </w:tc>

</xml_diff>